<commit_message>
Major debugging of analysis code
</commit_message>
<xml_diff>
--- a/260301 Artefact Analysis.docx
+++ b/260301 Artefact Analysis.docx
@@ -47,7 +47,7 @@
           <w:noProof/>
           <w:kern w:val="0"/>
         </w:rPr>
-        <w:pict w14:anchorId="05C9A33E">
+        <w:pict w14:anchorId="73930BBB">
           <v:rect id="_x0000_i1031" alt="" style="width:468pt;height:.05pt;mso-width-percent:0;mso-height-percent:0;mso-width-percent:0;mso-height-percent:0" o:hralign="center" o:hrstd="t" o:hr="t" fillcolor="#a0a0a0" stroked="f"/>
         </w:pict>
       </w:r>
@@ -237,7 +237,7 @@
           <w:noProof/>
           <w:kern w:val="0"/>
         </w:rPr>
-        <w:pict w14:anchorId="2E90C55E">
+        <w:pict w14:anchorId="13CDBB6D">
           <v:rect id="_x0000_i1030" alt="" style="width:468pt;height:.05pt;mso-width-percent:0;mso-height-percent:0;mso-width-percent:0;mso-height-percent:0" o:hralign="center" o:hrstd="t" o:hr="t" fillcolor="#a0a0a0" stroked="f"/>
         </w:pict>
       </w:r>
@@ -598,7 +598,7 @@
           <w:noProof/>
           <w:kern w:val="0"/>
         </w:rPr>
-        <w:pict w14:anchorId="5E86178D">
+        <w:pict w14:anchorId="600E33A0">
           <v:rect id="_x0000_i1029" alt="" style="width:468pt;height:.05pt;mso-width-percent:0;mso-height-percent:0;mso-width-percent:0;mso-height-percent:0" o:hralign="center" o:hrstd="t" o:hr="t" fillcolor="#a0a0a0" stroked="f"/>
         </w:pict>
       </w:r>
@@ -946,7 +946,7 @@
           <w:noProof/>
           <w:kern w:val="0"/>
         </w:rPr>
-        <w:pict w14:anchorId="47883C90">
+        <w:pict w14:anchorId="37F81103">
           <v:rect id="_x0000_i1028" alt="" style="width:468pt;height:.05pt;mso-width-percent:0;mso-height-percent:0;mso-width-percent:0;mso-height-percent:0" o:hralign="center" o:hrstd="t" o:hr="t" fillcolor="#a0a0a0" stroked="f"/>
         </w:pict>
       </w:r>
@@ -1020,7 +1020,7 @@
           <w:noProof/>
           <w:kern w:val="0"/>
         </w:rPr>
-        <w:pict w14:anchorId="5B8F586E">
+        <w:pict w14:anchorId="5D6A73B9">
           <v:rect id="_x0000_i1027" alt="" style="width:468pt;height:.05pt;mso-width-percent:0;mso-height-percent:0;mso-width-percent:0;mso-height-percent:0" o:hralign="center" o:hrstd="t" o:hr="t" fillcolor="#a0a0a0" stroked="f"/>
         </w:pict>
       </w:r>
@@ -1403,7 +1403,7 @@
           <w:noProof/>
           <w:kern w:val="0"/>
         </w:rPr>
-        <w:pict w14:anchorId="642A6F71">
+        <w:pict w14:anchorId="4AC99275">
           <v:rect id="_x0000_i1026" alt="" style="width:468pt;height:.05pt;mso-width-percent:0;mso-height-percent:0;mso-width-percent:0;mso-height-percent:0" o:hralign="center" o:hrstd="t" o:hr="t" fillcolor="#a0a0a0" stroked="f"/>
         </w:pict>
       </w:r>
@@ -1582,7 +1582,7 @@
           <w:noProof/>
           <w:kern w:val="0"/>
         </w:rPr>
-        <w:pict w14:anchorId="32155298">
+        <w:pict w14:anchorId="464EE7F7">
           <v:rect id="_x0000_i1025" alt="" style="width:468pt;height:.05pt;mso-width-percent:0;mso-height-percent:0;mso-width-percent:0;mso-height-percent:0" o:hralign="center" o:hrstd="t" o:hr="t" fillcolor="#a0a0a0" stroked="f"/>
         </w:pict>
       </w:r>

</xml_diff>